<commit_message>
massappct answering-brief: gated on every engine (the authority mark of a heading that ends a page settled in the model) (fb-595.54.68)
Co-Authored-By: Claude Opus 5.5 <noreply@anthropic.com>
</commit_message>
<xml_diff>
--- a/courts/first-circuit/massachusetts/state/appeals-court/answering-brief/usage/OUTPUT-answering-brief.docx
+++ b/courts/first-circuit/massachusetts/state/appeals-court/answering-brief/usage/OUTPUT-answering-brief.docx
@@ -7300,7 +7300,7 @@
         <w:pStyle w:val="XdTail"/>
       </w:pPr>
       <w:r>
-        <w:t xml:space="preserve">Defendants. This matter came before the court for hearing on June 22 , 2021 , at which the plaintiff landlord appeared with counsel and the defendant tenant Laural Charland appeared with counsel along with co-defendant Jason Charland who appeared prose . After said hearing , the following order shall enter:</w:t>
+        <w:t xml:space="preserve">Defendants. This matter came before the court for hearing on June 22 ⁠, 2021 ⁠, at which the plaintiff landlord appeared with counsel and the defendant tenant Laural Charland appeared with counsel along with co-defendant Jason Charland who appeared prose ⁠. After said hearing ⁠, the following order shall enter:</w:t>
       </w:r>
     </w:p>
     <w:p>
@@ -7314,7 +7314,7 @@
         <w:tab/>
       </w:r>
       <w:r>
-        <w:t xml:space="preserve">Preliminary Matter: Water Charges under G.L. c.186, s.22: There is no question that the tenants asserted a claim that the landlord violated G.L. c.186, s.22 . and there is also no question that such claim triggers</w:t>
+        <w:t xml:space="preserve">Preliminary Matter: Water Charges under G.L. c.186, s.22: There is no question that the tenants asserted a claim that the landlord violated G.L. c.186, s.22 ⁠. and there is also no question that such claim triggers</w:t>
       </w:r>
       <w:r>
         <w:t xml:space="preserve"> </w:t>
@@ -7326,19 +7326,19 @@
         <w:t xml:space="preserve"> </w:t>
       </w:r>
       <w:r>
-        <w:t xml:space="preserve">under G. L. c. 239 , s.8A.</w:t>
-      </w:r>
-      <w:r>
-        <w:t xml:space="preserve"> </w:t>
-      </w:r>
-      <w:r>
-        <w:t xml:space="preserve">The question posed by this case is whether after the landlord tendered full compensation to the tenant for her claim under G.L. c.186, s.22 can she still assert said claim at trial to trigger the application of G.L c. 239 , s.8A</w:t>
-      </w:r>
-      <w:r>
-        <w:t xml:space="preserve"> </w:t>
-      </w:r>
-      <w:r>
-        <w:t xml:space="preserve">as a defense to possession . Given that the landlord tendered all the funds for the damages asserted under that claim and that they were knowingly accepted by the tenants without any reservation of rights , such tender and acceptance satisfied and resolved the tenants’ claim under G.L. c.186, s.22 and it can not be used to trigger a defense to possession under G.L. c.239 , s.8A.</w:t>
+        <w:t xml:space="preserve">under G. L. c. 239 ⁠, s.8A.</w:t>
+      </w:r>
+      <w:r>
+        <w:t xml:space="preserve"> </w:t>
+      </w:r>
+      <w:r>
+        <w:t xml:space="preserve">The question posed by this case is whether after the landlord tendered full compensation to the tenant for her claim under G.L. c.186, s.22 can she still assert said claim at trial to trigger the application of G.L c. 239 ⁠, s.8A</w:t>
+      </w:r>
+      <w:r>
+        <w:t xml:space="preserve"> </w:t>
+      </w:r>
+      <w:r>
+        <w:t xml:space="preserve">as a defense to possession ⁠. Given that the landlord tendered all the funds for the damages asserted under that claim and that they were knowingly accepted by the tenants without any reservation of rights ⁠, such tender and acceptance satisfied and resolved the tenants’ claim under G.L. c.186, s.22 and it can not be used to trigger a defense to possession under G.L. c.239 ⁠, s.8A.</w:t>
       </w:r>
     </w:p>
     <w:p>
@@ -7352,7 +7352,7 @@
         <w:tab/>
       </w:r>
       <w:r>
-        <w:t xml:space="preserve">G.L. c.239, s.9: The parties were also heard on the tenants’ request that judgment be stayed in accordance with G.L. c.239 , s.9. Pursuant to that statute , the court is directed to hear from all parties and achieve an order and an extension of time , if warranted , that is</w:t>
+        <w:t xml:space="preserve">G.L. c.239, s.9: The parties were also heard on the tenants’ request that judgment be stayed in accordance with G.L. c.239 ⁠, s.9. Pursuant to that statute ⁠, the court is directed to hear from all parties and achieve an order and an extension of time ⁠, if warranted ⁠, that is</w:t>
       </w:r>
       <w:r>
         <w:t xml:space="preserve"> </w:t>
@@ -7361,7 +7361,7 @@
         <w:t xml:space="preserve">“just and reasonable”</w:t>
       </w:r>
       <w:r>
-        <w:t xml:space="preserve">. This is often a difficult task for a court but the facts of this matter make it extremely difficult as both sides present very compelling needs and circumstances .</w:t>
+        <w:t xml:space="preserve">. This is often a difficult task for a court but the facts of this matter make it extremely difficult as both sides present very compelling needs and circumstances ⁠.</w:t>
       </w:r>
     </w:p>
     <w:p>
@@ -7375,7 +7375,7 @@
         <w:tab/>
       </w:r>
       <w:r>
-        <w:t xml:space="preserve">The tenants (Laural Charland and her brother Jason Charland) are both disabled and have limited income from Social Security benefits and food stamps . Ms . Charland testified credibly of her very extensive housing search in all towns around and between Ludlow and Agawam , other than avoiding inner-city locations.</w:t>
+        <w:t xml:space="preserve">The tenants (Laural Charland and her brother Jason Charland) are both disabled and have limited income from Social Security benefits and food stamps ⁠. Ms ⁠. Charland testified credibly of her very extensive housing search in all towns around and between Ludlow and Agawam ⁠, other than avoiding inner-city locations.</w:t>
       </w:r>
     </w:p>
     <w:p>
@@ -7389,7 +7389,7 @@
         <w:tab/>
       </w:r>
       <w:r>
-        <w:t xml:space="preserve">The landlord also finds herself in dire straits , mostly residing on a couch in her parents’ basement for a very protracted time and with no other options available to her until she can re-possess the subject premises for her own residence . Ms. Ferreira also reported to the court that she has a medical condition that will</w:t>
+        <w:t xml:space="preserve">The landlord also finds herself in dire straits ⁠, mostly residing on a couch in her parents’ basement for a very protracted time and with no other options available to her until she can re-possess the subject premises for her own residence ⁠. Ms. Ferreira also reported to the court that she has a medical condition that will</w:t>
       </w:r>
     </w:p>
     <w:p>
@@ -7397,7 +7397,7 @@
         <w:pStyle w:val="XdTail"/>
       </w:pPr>
       <w:r>
-        <w:t xml:space="preserve">require her to have a procedure at the end of August, 2021 and will require a slow recovery thereafter—of course , a recovery hopefully not on her parents’ couch .</w:t>
+        <w:t xml:space="preserve">require her to have a procedure at the end of August, 2021 and will require a slow recovery thereafter—of course ⁠, a recovery hopefully not on her parents’ couch ⁠.</w:t>
       </w:r>
     </w:p>
     <w:p>
@@ -7419,7 +7419,7 @@
         <w:pStyle w:val="XdTail"/>
       </w:pPr>
       <w:r>
-        <w:t xml:space="preserve">September 1, 2021 and the tenants have until August 31 , 2021 to vacate the premises and are required to pay use and occupancy through their vacating the unit. \X\ So entered this as dayof 3..\lne , 2021 . Robert Fields , Associate Justice Cc: Court Reporter</w:t>
+        <w:t xml:space="preserve">September 1, 2021 and the tenants have until August 31 ⁠, 2021 to vacate the premises and are required to pay use and occupancy through their vacating the unit. \X\ So entered this as dayof 3..\lne ⁠, 2021 ⁠. Robert Fields ⁠, Associate Justice Cc: Court Reporter</w:t>
       </w:r>
     </w:p>
     <w:p>

</xml_diff>